<commit_message>
1.3.7-rasm namunasi: o‘qda faqat yillar
Co-Authored-By: Claude Opus 5.5 <noreply@anthropic.com>
Claude-Session: https://claude.ai/code/session_01PxHTC8Q7yHdrpAeUA5KUgM
</commit_message>
<xml_diff>
--- a/Namuna_1.3.7-rasm_yangi.docx
+++ b/Namuna_1.3.7-rasm_yangi.docx
@@ -24082,19 +24082,19 @@
               <c:strCache>
                 <c:ptCount val="7"/>
                 <c:pt idx="0">
-                  <c:v>2021-y. oxiri</c:v>
+                  <c:v>2021</c:v>
                 </c:pt>
                 <c:pt idx="1">
-                  <c:v>2022-y. oxiri</c:v>
+                  <c:v>2022</c:v>
                 </c:pt>
                 <c:pt idx="2">
-                  <c:v>2023-y. oxiri</c:v>
+                  <c:v>2023</c:v>
                 </c:pt>
                 <c:pt idx="3">
-                  <c:v>2024-y. oxiri</c:v>
+                  <c:v>2024</c:v>
                 </c:pt>
                 <c:pt idx="4">
-                  <c:v>2025-y. oxiri</c:v>
+                  <c:v>2025</c:v>
                 </c:pt>
                 <c:pt idx="5">
                   <c:v>Ilmiy baho:
@@ -24195,19 +24195,19 @@
               <c:strCache>
                 <c:ptCount val="7"/>
                 <c:pt idx="0">
-                  <c:v>2021-y. oxiri</c:v>
+                  <c:v>2021</c:v>
                 </c:pt>
                 <c:pt idx="1">
-                  <c:v>2022-y. oxiri</c:v>
+                  <c:v>2022</c:v>
                 </c:pt>
                 <c:pt idx="2">
-                  <c:v>2023-y. oxiri</c:v>
+                  <c:v>2023</c:v>
                 </c:pt>
                 <c:pt idx="3">
-                  <c:v>2024-y. oxiri</c:v>
+                  <c:v>2024</c:v>
                 </c:pt>
                 <c:pt idx="4">
-                  <c:v>2025-y. oxiri</c:v>
+                  <c:v>2025</c:v>
                 </c:pt>
                 <c:pt idx="5">
                   <c:v>Ilmiy baho:
@@ -24308,19 +24308,19 @@
               <c:strCache>
                 <c:ptCount val="7"/>
                 <c:pt idx="0">
-                  <c:v>2021-y. oxiri</c:v>
+                  <c:v>2021</c:v>
                 </c:pt>
                 <c:pt idx="1">
-                  <c:v>2022-y. oxiri</c:v>
+                  <c:v>2022</c:v>
                 </c:pt>
                 <c:pt idx="2">
-                  <c:v>2023-y. oxiri</c:v>
+                  <c:v>2023</c:v>
                 </c:pt>
                 <c:pt idx="3">
-                  <c:v>2024-y. oxiri</c:v>
+                  <c:v>2024</c:v>
                 </c:pt>
                 <c:pt idx="4">
-                  <c:v>2025-y. oxiri</c:v>
+                  <c:v>2025</c:v>
                 </c:pt>
                 <c:pt idx="5">
                   <c:v>Ilmiy baho:

</xml_diff>